<commit_message>
fix: corrige no padrão de codificação a nomenclatura dos atributos para que iniciem com letra minúscula. Issue #14
</commit_message>
<xml_diff>
--- a/Gerenciamento/DocumentoPadraoCodificacaoBD_BemMeCare.docx
+++ b/Gerenciamento/DocumentoPadraoCodificacaoBD_BemMeCare.docx
@@ -852,6 +852,7 @@
         <w:r>
           <w:rPr>
             <w:noProof/>
+            <w:webHidden/>
           </w:rPr>
         </w:r>
         <w:r>
@@ -943,6 +944,7 @@
         <w:r>
           <w:rPr>
             <w:noProof/>
+            <w:webHidden/>
           </w:rPr>
         </w:r>
         <w:r>
@@ -1040,6 +1042,7 @@
           <w:rPr>
             <w:b w:val="0"/>
             <w:noProof/>
+            <w:webHidden/>
           </w:rPr>
         </w:r>
         <w:r>
@@ -1140,6 +1143,7 @@
           <w:rPr>
             <w:b w:val="0"/>
             <w:noProof/>
+            <w:webHidden/>
           </w:rPr>
         </w:r>
         <w:r>
@@ -1240,6 +1244,7 @@
           <w:rPr>
             <w:b w:val="0"/>
             <w:noProof/>
+            <w:webHidden/>
           </w:rPr>
         </w:r>
         <w:r>
@@ -1334,6 +1339,7 @@
         <w:r>
           <w:rPr>
             <w:noProof/>
+            <w:webHidden/>
           </w:rPr>
         </w:r>
         <w:r>
@@ -1431,6 +1437,7 @@
           <w:rPr>
             <w:b w:val="0"/>
             <w:noProof/>
+            <w:webHidden/>
           </w:rPr>
         </w:r>
         <w:r>
@@ -1531,6 +1538,7 @@
           <w:rPr>
             <w:b w:val="0"/>
             <w:noProof/>
+            <w:webHidden/>
           </w:rPr>
         </w:r>
         <w:r>
@@ -1631,6 +1639,7 @@
           <w:rPr>
             <w:b w:val="0"/>
             <w:noProof/>
+            <w:webHidden/>
           </w:rPr>
         </w:r>
         <w:r>
@@ -1725,6 +1734,7 @@
         <w:r>
           <w:rPr>
             <w:noProof/>
+            <w:webHidden/>
           </w:rPr>
         </w:r>
         <w:r>
@@ -1822,6 +1832,7 @@
           <w:rPr>
             <w:b w:val="0"/>
             <w:noProof/>
+            <w:webHidden/>
           </w:rPr>
         </w:r>
         <w:r>
@@ -1922,6 +1933,7 @@
           <w:rPr>
             <w:b w:val="0"/>
             <w:noProof/>
+            <w:webHidden/>
           </w:rPr>
         </w:r>
         <w:r>
@@ -2022,6 +2034,7 @@
           <w:rPr>
             <w:b w:val="0"/>
             <w:noProof/>
+            <w:webHidden/>
           </w:rPr>
         </w:r>
         <w:r>
@@ -2116,6 +2129,7 @@
         <w:r>
           <w:rPr>
             <w:noProof/>
+            <w:webHidden/>
           </w:rPr>
         </w:r>
         <w:r>
@@ -2213,6 +2227,7 @@
           <w:rPr>
             <w:b w:val="0"/>
             <w:noProof/>
+            <w:webHidden/>
           </w:rPr>
         </w:r>
         <w:r>
@@ -2313,6 +2328,7 @@
           <w:rPr>
             <w:b w:val="0"/>
             <w:noProof/>
+            <w:webHidden/>
           </w:rPr>
         </w:r>
         <w:r>
@@ -2413,6 +2429,7 @@
           <w:rPr>
             <w:b w:val="0"/>
             <w:noProof/>
+            <w:webHidden/>
           </w:rPr>
         </w:r>
         <w:r>
@@ -2507,6 +2524,7 @@
         <w:r>
           <w:rPr>
             <w:noProof/>
+            <w:webHidden/>
           </w:rPr>
         </w:r>
         <w:r>
@@ -2604,6 +2622,7 @@
           <w:rPr>
             <w:b w:val="0"/>
             <w:noProof/>
+            <w:webHidden/>
           </w:rPr>
         </w:r>
         <w:r>
@@ -2704,6 +2723,7 @@
           <w:rPr>
             <w:b w:val="0"/>
             <w:noProof/>
+            <w:webHidden/>
           </w:rPr>
         </w:r>
         <w:r>
@@ -2804,6 +2824,7 @@
           <w:rPr>
             <w:b w:val="0"/>
             <w:noProof/>
+            <w:webHidden/>
           </w:rPr>
         </w:r>
         <w:r>
@@ -2898,6 +2919,7 @@
         <w:r>
           <w:rPr>
             <w:noProof/>
+            <w:webHidden/>
           </w:rPr>
         </w:r>
         <w:r>
@@ -2995,6 +3017,7 @@
           <w:rPr>
             <w:b w:val="0"/>
             <w:noProof/>
+            <w:webHidden/>
           </w:rPr>
         </w:r>
         <w:r>
@@ -3095,6 +3118,7 @@
           <w:rPr>
             <w:b w:val="0"/>
             <w:noProof/>
+            <w:webHidden/>
           </w:rPr>
         </w:r>
         <w:r>
@@ -3195,6 +3219,7 @@
           <w:rPr>
             <w:b w:val="0"/>
             <w:noProof/>
+            <w:webHidden/>
           </w:rPr>
         </w:r>
         <w:r>
@@ -3289,6 +3314,7 @@
         <w:r>
           <w:rPr>
             <w:noProof/>
+            <w:webHidden/>
           </w:rPr>
         </w:r>
         <w:r>
@@ -3386,6 +3412,7 @@
           <w:rPr>
             <w:b w:val="0"/>
             <w:noProof/>
+            <w:webHidden/>
           </w:rPr>
         </w:r>
         <w:r>
@@ -3486,6 +3513,7 @@
           <w:rPr>
             <w:b w:val="0"/>
             <w:noProof/>
+            <w:webHidden/>
           </w:rPr>
         </w:r>
         <w:r>
@@ -3586,6 +3614,7 @@
           <w:rPr>
             <w:b w:val="0"/>
             <w:noProof/>
+            <w:webHidden/>
           </w:rPr>
         </w:r>
         <w:r>
@@ -3680,6 +3709,7 @@
         <w:r>
           <w:rPr>
             <w:noProof/>
+            <w:webHidden/>
           </w:rPr>
         </w:r>
         <w:r>
@@ -3777,6 +3807,7 @@
           <w:rPr>
             <w:b w:val="0"/>
             <w:noProof/>
+            <w:webHidden/>
           </w:rPr>
         </w:r>
         <w:r>
@@ -3877,6 +3908,7 @@
           <w:rPr>
             <w:b w:val="0"/>
             <w:noProof/>
+            <w:webHidden/>
           </w:rPr>
         </w:r>
         <w:r>
@@ -3977,6 +4009,7 @@
           <w:rPr>
             <w:b w:val="0"/>
             <w:noProof/>
+            <w:webHidden/>
           </w:rPr>
         </w:r>
         <w:r>
@@ -4071,6 +4104,7 @@
         <w:r>
           <w:rPr>
             <w:noProof/>
+            <w:webHidden/>
           </w:rPr>
         </w:r>
         <w:r>
@@ -4168,6 +4202,7 @@
           <w:rPr>
             <w:b w:val="0"/>
             <w:noProof/>
+            <w:webHidden/>
           </w:rPr>
         </w:r>
         <w:r>
@@ -4268,6 +4303,7 @@
           <w:rPr>
             <w:b w:val="0"/>
             <w:noProof/>
+            <w:webHidden/>
           </w:rPr>
         </w:r>
         <w:r>
@@ -4368,6 +4404,7 @@
           <w:rPr>
             <w:b w:val="0"/>
             <w:noProof/>
+            <w:webHidden/>
           </w:rPr>
         </w:r>
         <w:r>
@@ -5414,7 +5451,13 @@
         <w:jc w:val="both"/>
       </w:pPr>
       <w:r>
-        <w:t>Primeira letra deverá ser maiúscula e as demais minúsculas. Para cada palavra interna, primeira letra em maiúsculo.</w:t>
+        <w:t>Primeira letra deverá ser</w:t>
+      </w:r>
+      <w:r>
+        <w:t xml:space="preserve"> minúscula</w:t>
+      </w:r>
+      <w:r>
+        <w:t>. Para cada palavra interna, primeira letra em maiúsculo.</w:t>
       </w:r>
     </w:p>
     <w:p>
@@ -5465,7 +5508,6 @@
         <w:jc w:val="both"/>
       </w:pPr>
       <w:r>
-        <w:lastRenderedPageBreak/>
         <w:t>Evite usar abreviações, se necessário use as conhecidas. Abreviações limitadas a 4 caracteres.</w:t>
       </w:r>
     </w:p>
@@ -5500,6 +5542,7 @@
         <w:jc w:val="both"/>
       </w:pPr>
       <w:r>
+        <w:lastRenderedPageBreak/>
         <w:t>Atributo para chaves primárias artificiais devem usar o nome Id</w:t>
       </w:r>
     </w:p>
@@ -5563,7 +5606,7 @@
         <w:jc w:val="both"/>
       </w:pPr>
       <w:r>
-        <w:t>I</w:t>
+        <w:t>i</w:t>
       </w:r>
       <w:r>
         <w:t>d</w:t>
@@ -5575,7 +5618,7 @@
         <w:jc w:val="both"/>
       </w:pPr>
       <w:r>
-        <w:t>N</w:t>
+        <w:t>n</w:t>
       </w:r>
       <w:r>
         <w:t>ome</w:t>
@@ -5588,7 +5631,10 @@
       </w:pPr>
       <w:proofErr w:type="spellStart"/>
       <w:r>
-        <w:t>PrecoFinal</w:t>
+        <w:t>p</w:t>
+      </w:r>
+      <w:r>
+        <w:t>recoFinal</w:t>
       </w:r>
       <w:proofErr w:type="spellEnd"/>
     </w:p>
@@ -5599,7 +5645,7 @@
       </w:pPr>
       <w:proofErr w:type="spellStart"/>
       <w:r>
-        <w:t>D</w:t>
+        <w:t>d</w:t>
       </w:r>
       <w:r>
         <w:t>ataNascimento</w:t>
@@ -5634,7 +5680,7 @@
       </w:pPr>
       <w:proofErr w:type="spellStart"/>
       <w:r>
-        <w:t>I</w:t>
+        <w:t>i</w:t>
       </w:r>
       <w:r>
         <w:t>d</w:t>
@@ -5651,7 +5697,10 @@
       </w:pPr>
       <w:proofErr w:type="spellStart"/>
       <w:r>
-        <w:t>Cpf</w:t>
+        <w:t>c</w:t>
+      </w:r>
+      <w:r>
+        <w:t>pf</w:t>
       </w:r>
       <w:proofErr w:type="spellEnd"/>
     </w:p>
@@ -5661,7 +5710,10 @@
         <w:jc w:val="both"/>
       </w:pPr>
       <w:r>
-        <w:t>Cep</w:t>
+        <w:t>c</w:t>
+      </w:r>
+      <w:r>
+        <w:t>ep</w:t>
       </w:r>
     </w:p>
     <w:p>
@@ -6054,7 +6106,6 @@
       <w:bookmarkStart w:id="20" w:name="_Toc203191540"/>
       <w:proofErr w:type="spellStart"/>
       <w:r>
-        <w:lastRenderedPageBreak/>
         <w:t>Regra</w:t>
       </w:r>
       <w:proofErr w:type="spellEnd"/>
@@ -6666,7 +6717,6 @@
         <w:jc w:val="both"/>
       </w:pPr>
       <w:r>
-        <w:lastRenderedPageBreak/>
         <w:t>Inserir comentários sempre que necessário. Comentário</w:t>
       </w:r>
       <w:r>
@@ -6718,6 +6768,7 @@
       <w:bookmarkStart w:id="26" w:name="_Toc203191546"/>
       <w:proofErr w:type="spellStart"/>
       <w:r>
+        <w:lastRenderedPageBreak/>
         <w:t>Exemplos</w:t>
       </w:r>
       <w:bookmarkEnd w:id="26"/>
@@ -7369,53 +7420,53 @@
       <w:bookmarkStart w:id="32" w:name="_Toc203191552"/>
       <w:proofErr w:type="spellStart"/>
       <w:r>
+        <w:t>Regra</w:t>
+      </w:r>
+      <w:proofErr w:type="spellEnd"/>
+      <w:r>
+        <w:t xml:space="preserve"> Geral</w:t>
+      </w:r>
+      <w:bookmarkEnd w:id="32"/>
+    </w:p>
+    <w:p>
+      <w:pPr>
+        <w:pStyle w:val="EstiloJustificadoPrimeiralinha15cm"/>
+      </w:pPr>
+    </w:p>
+    <w:p>
+      <w:pPr>
+        <w:ind w:firstLine="709"/>
+        <w:jc w:val="both"/>
+      </w:pPr>
+      <w:r>
+        <w:t>Especifica que uma condição deve ser atendida por cada tupla da tabela.</w:t>
+      </w:r>
+    </w:p>
+    <w:p>
+      <w:pPr>
+        <w:ind w:firstLine="709"/>
+        <w:jc w:val="both"/>
+      </w:pPr>
+    </w:p>
+    <w:p>
+      <w:pPr>
+        <w:ind w:firstLine="709"/>
+        <w:jc w:val="both"/>
+      </w:pPr>
+    </w:p>
+    <w:p>
+      <w:pPr>
+        <w:pStyle w:val="Qualiti-Ttulo2"/>
+        <w:rPr>
+          <w:lang w:val="pt-BR"/>
+        </w:rPr>
+      </w:pPr>
+      <w:bookmarkStart w:id="33" w:name="_Toc203191553"/>
+      <w:r>
+        <w:rPr>
+          <w:lang w:val="pt-BR"/>
+        </w:rPr>
         <w:lastRenderedPageBreak/>
-        <w:t>Regra</w:t>
-      </w:r>
-      <w:proofErr w:type="spellEnd"/>
-      <w:r>
-        <w:t xml:space="preserve"> Geral</w:t>
-      </w:r>
-      <w:bookmarkEnd w:id="32"/>
-    </w:p>
-    <w:p>
-      <w:pPr>
-        <w:pStyle w:val="EstiloJustificadoPrimeiralinha15cm"/>
-      </w:pPr>
-    </w:p>
-    <w:p>
-      <w:pPr>
-        <w:ind w:firstLine="709"/>
-        <w:jc w:val="both"/>
-      </w:pPr>
-      <w:r>
-        <w:t>Especifica que uma condição deve ser atendida por cada tupla da tabela.</w:t>
-      </w:r>
-    </w:p>
-    <w:p>
-      <w:pPr>
-        <w:ind w:firstLine="709"/>
-        <w:jc w:val="both"/>
-      </w:pPr>
-    </w:p>
-    <w:p>
-      <w:pPr>
-        <w:ind w:firstLine="709"/>
-        <w:jc w:val="both"/>
-      </w:pPr>
-    </w:p>
-    <w:p>
-      <w:pPr>
-        <w:pStyle w:val="Qualiti-Ttulo2"/>
-        <w:rPr>
-          <w:lang w:val="pt-BR"/>
-        </w:rPr>
-      </w:pPr>
-      <w:bookmarkStart w:id="33" w:name="_Toc203191553"/>
-      <w:r>
-        <w:rPr>
-          <w:lang w:val="pt-BR"/>
-        </w:rPr>
         <w:t>Sintaxe</w:t>
       </w:r>
       <w:bookmarkEnd w:id="33"/>
@@ -7641,6 +7692,7 @@
         <w:ind w:firstLine="709"/>
         <w:jc w:val="both"/>
       </w:pPr>
+      <w:proofErr w:type="spellStart"/>
       <w:r>
         <w:t>CHK</w:t>
       </w:r>
@@ -7657,6 +7709,7 @@
       <w:r>
         <w:t>Cpf</w:t>
       </w:r>
+      <w:proofErr w:type="spellEnd"/>
       <w:r>
         <w:t xml:space="preserve"> </w:t>
       </w:r>
@@ -8080,7 +8133,6 @@
       <w:jc w:val="right"/>
       <w:rPr>
         <w:sz w:val="20"/>
-        <w:lang w:val="pt-BR"/>
       </w:rPr>
     </w:pPr>
   </w:p>
@@ -11378,6 +11430,50 @@
     <w:lsdException w:name="Subtitle" w:qFormat="1"/>
     <w:lsdException w:name="Strong" w:qFormat="1"/>
     <w:lsdException w:name="Emphasis" w:qFormat="1"/>
+    <w:lsdException w:name="Normal Table" w:semiHidden="1" w:unhideWhenUsed="1"/>
+    <w:lsdException w:name="Table Simple 1" w:semiHidden="1" w:unhideWhenUsed="1"/>
+    <w:lsdException w:name="Table Simple 2" w:semiHidden="1" w:unhideWhenUsed="1"/>
+    <w:lsdException w:name="Table Simple 3" w:semiHidden="1" w:unhideWhenUsed="1"/>
+    <w:lsdException w:name="Table Classic 1" w:semiHidden="1" w:unhideWhenUsed="1"/>
+    <w:lsdException w:name="Table Classic 2" w:semiHidden="1" w:unhideWhenUsed="1"/>
+    <w:lsdException w:name="Table Classic 3" w:semiHidden="1" w:unhideWhenUsed="1"/>
+    <w:lsdException w:name="Table Classic 4" w:semiHidden="1" w:unhideWhenUsed="1"/>
+    <w:lsdException w:name="Table Colorful 1" w:semiHidden="1" w:unhideWhenUsed="1"/>
+    <w:lsdException w:name="Table Colorful 2" w:semiHidden="1" w:unhideWhenUsed="1"/>
+    <w:lsdException w:name="Table Colorful 3" w:semiHidden="1" w:unhideWhenUsed="1"/>
+    <w:lsdException w:name="Table Columns 1" w:semiHidden="1" w:unhideWhenUsed="1"/>
+    <w:lsdException w:name="Table Columns 2" w:semiHidden="1" w:unhideWhenUsed="1"/>
+    <w:lsdException w:name="Table Columns 3" w:semiHidden="1" w:unhideWhenUsed="1"/>
+    <w:lsdException w:name="Table Columns 4" w:semiHidden="1" w:unhideWhenUsed="1"/>
+    <w:lsdException w:name="Table Columns 5" w:semiHidden="1" w:unhideWhenUsed="1"/>
+    <w:lsdException w:name="Table Grid 1" w:semiHidden="1" w:unhideWhenUsed="1"/>
+    <w:lsdException w:name="Table Grid 2" w:semiHidden="1" w:unhideWhenUsed="1"/>
+    <w:lsdException w:name="Table Grid 3" w:semiHidden="1" w:unhideWhenUsed="1"/>
+    <w:lsdException w:name="Table Grid 4" w:semiHidden="1" w:unhideWhenUsed="1"/>
+    <w:lsdException w:name="Table Grid 5" w:semiHidden="1" w:unhideWhenUsed="1"/>
+    <w:lsdException w:name="Table Grid 6" w:semiHidden="1" w:unhideWhenUsed="1"/>
+    <w:lsdException w:name="Table Grid 7" w:semiHidden="1" w:unhideWhenUsed="1"/>
+    <w:lsdException w:name="Table Grid 8" w:semiHidden="1" w:unhideWhenUsed="1"/>
+    <w:lsdException w:name="Table List 1" w:semiHidden="1" w:unhideWhenUsed="1"/>
+    <w:lsdException w:name="Table List 2" w:semiHidden="1" w:unhideWhenUsed="1"/>
+    <w:lsdException w:name="Table List 3" w:semiHidden="1" w:unhideWhenUsed="1"/>
+    <w:lsdException w:name="Table List 4" w:semiHidden="1" w:unhideWhenUsed="1"/>
+    <w:lsdException w:name="Table List 5" w:semiHidden="1" w:unhideWhenUsed="1"/>
+    <w:lsdException w:name="Table List 6" w:semiHidden="1" w:unhideWhenUsed="1"/>
+    <w:lsdException w:name="Table List 7" w:semiHidden="1" w:unhideWhenUsed="1"/>
+    <w:lsdException w:name="Table List 8" w:semiHidden="1" w:unhideWhenUsed="1"/>
+    <w:lsdException w:name="Table 3D effects 1" w:semiHidden="1" w:unhideWhenUsed="1"/>
+    <w:lsdException w:name="Table 3D effects 2" w:semiHidden="1" w:unhideWhenUsed="1"/>
+    <w:lsdException w:name="Table 3D effects 3" w:semiHidden="1" w:unhideWhenUsed="1"/>
+    <w:lsdException w:name="Table Contemporary" w:semiHidden="1" w:unhideWhenUsed="1"/>
+    <w:lsdException w:name="Table Elegant" w:semiHidden="1" w:unhideWhenUsed="1"/>
+    <w:lsdException w:name="Table Professional" w:semiHidden="1" w:unhideWhenUsed="1"/>
+    <w:lsdException w:name="Table Subtle 1" w:semiHidden="1" w:unhideWhenUsed="1"/>
+    <w:lsdException w:name="Table Subtle 2" w:semiHidden="1" w:unhideWhenUsed="1"/>
+    <w:lsdException w:name="Table Web 1" w:semiHidden="1" w:unhideWhenUsed="1"/>
+    <w:lsdException w:name="Table Web 2" w:semiHidden="1" w:unhideWhenUsed="1"/>
+    <w:lsdException w:name="Table Web 3" w:semiHidden="1" w:unhideWhenUsed="1"/>
+    <w:lsdException w:name="Table Theme" w:semiHidden="1" w:unhideWhenUsed="1"/>
     <w:lsdException w:name="Placeholder Text" w:semiHidden="1" w:uiPriority="99"/>
     <w:lsdException w:name="No Spacing" w:uiPriority="1" w:qFormat="1"/>
     <w:lsdException w:name="Light Shading" w:uiPriority="60"/>
@@ -11673,11 +11769,15 @@
   </w:style>
   <w:style w:type="character" w:default="1" w:styleId="Fontepargpadro">
     <w:name w:val="Default Paragraph Font"/>
+    <w:uiPriority w:val="1"/>
     <w:semiHidden/>
+    <w:unhideWhenUsed/>
   </w:style>
   <w:style w:type="table" w:default="1" w:styleId="Tabelanormal">
     <w:name w:val="Normal Table"/>
+    <w:uiPriority w:val="99"/>
     <w:semiHidden/>
+    <w:unhideWhenUsed/>
     <w:tblPr>
       <w:tblInd w:w="0" w:type="dxa"/>
       <w:tblCellMar>
@@ -11690,7 +11790,9 @@
   </w:style>
   <w:style w:type="numbering" w:default="1" w:styleId="Semlista">
     <w:name w:val="No List"/>
+    <w:uiPriority w:val="99"/>
     <w:semiHidden/>
+    <w:unhideWhenUsed/>
   </w:style>
   <w:style w:type="character" w:customStyle="1" w:styleId="WW-Absatz-Standardschriftart">
     <w:name w:val="WW-Absatz-Standardschriftart"/>
@@ -11980,8 +12082,8 @@
       <w:lang w:val="en-US"/>
     </w:rPr>
   </w:style>
-  <w:style w:type="paragraph" w:customStyle="1" w:styleId="title">
-    <w:name w:val="title"/>
+  <w:style w:type="paragraph" w:customStyle="1" w:styleId="Ttulo20">
+    <w:name w:val="Título2"/>
     <w:basedOn w:val="Normal"/>
     <w:next w:val="Normal"/>
     <w:pPr>

</xml_diff>

<commit_message>
fix: ajuste de relacionamento e nomenclatura de atributo(feito em conjunto). Close #15
</commit_message>
<xml_diff>
--- a/Gerenciamento/DocumentoPadraoCodificacaoBD_BemMeCare.docx
+++ b/Gerenciamento/DocumentoPadraoCodificacaoBD_BemMeCare.docx
@@ -1368,10 +1368,6 @@
     <w:p>
       <w:pPr>
         <w:pStyle w:val="Sumrio1"/>
-        <w:tabs>
-          <w:tab w:val="left" w:pos="720"/>
-          <w:tab w:val="right" w:leader="dot" w:pos="9910"/>
-        </w:tabs>
         <w:rPr>
           <w:b w:val="0"/>
           <w:caps w:val="0"/>
@@ -5391,23 +5387,36 @@
         <w:jc w:val="both"/>
       </w:pPr>
       <w:r>
-        <w:t>{[</w:t>
-      </w:r>
+        <w:t>{</w:t>
+      </w:r>
+      <w:proofErr w:type="spellStart"/>
       <w:proofErr w:type="gramStart"/>
       <w:r>
-        <w:t>A..Z</w:t>
-      </w:r>
+        <w:t>a..z</w:t>
+      </w:r>
+      <w:proofErr w:type="spellEnd"/>
       <w:proofErr w:type="gramEnd"/>
       <w:r>
-        <w:t>][</w:t>
+        <w:t>]</w:t>
+      </w:r>
+      <w:r>
+        <w:t>[</w:t>
       </w:r>
       <w:proofErr w:type="gramStart"/>
       <w:r>
-        <w:t>a..z</w:t>
+        <w:t>A..Z][</w:t>
       </w:r>
       <w:proofErr w:type="gramEnd"/>
       <w:r>
-        <w:t>]} → Xxxxx, onde:</w:t>
+        <w:t xml:space="preserve">} → </w:t>
+      </w:r>
+      <w:proofErr w:type="spellStart"/>
+      <w:r>
+        <w:t>xxxx</w:t>
+      </w:r>
+      <w:proofErr w:type="spellEnd"/>
+      <w:r>
+        <w:t>, onde:</w:t>
       </w:r>
     </w:p>
     <w:p>
@@ -5421,8 +5430,13 @@
         <w:ind w:firstLine="709"/>
         <w:jc w:val="both"/>
       </w:pPr>
-      <w:r>
-        <w:t xml:space="preserve">Xxxxx – indica o nome </w:t>
+      <w:proofErr w:type="spellStart"/>
+      <w:r>
+        <w:t>xxxx</w:t>
+      </w:r>
+      <w:proofErr w:type="spellEnd"/>
+      <w:r>
+        <w:t xml:space="preserve"> – indica o nome </w:t>
       </w:r>
       <w:r>
         <w:t>dos atributos</w:t>

</xml_diff>